<commit_message>
docs : Modification Product-vision-board
</commit_message>
<xml_diff>
--- a/docs/Cadrage projet/equipe-13-customer-journey-v1.0.docx
+++ b/docs/Cadrage projet/equipe-13-customer-journey-v1.0.docx
@@ -930,21 +930,7 @@
             <w:rStyle w:val="Lienhypertexte"/>
             <w:noProof/>
           </w:rPr>
-          <w:t xml:space="preserve"> Références et </w:t>
-        </w:r>
-        <w:r>
-          <w:rPr>
-            <w:rStyle w:val="Lienhypertexte"/>
-            <w:noProof/>
-          </w:rPr>
-          <w:t>c</w:t>
-        </w:r>
-        <w:r>
-          <w:rPr>
-            <w:rStyle w:val="Lienhypertexte"/>
-            <w:noProof/>
-          </w:rPr>
-          <w:t>onventions</w:t>
+          <w:t xml:space="preserve"> Références et conventions</w:t>
         </w:r>
         <w:r>
           <w:rPr>
@@ -2244,8 +2230,13 @@
             </w:r>
             <w:proofErr w:type="spellEnd"/>
             <w:r>
-              <w:t xml:space="preserve"> → 😊 Soulagée</w:t>
-            </w:r>
+              <w:t xml:space="preserve"> → 😊 </w:t>
+            </w:r>
+            <w:proofErr w:type="spellStart"/>
+            <w:r>
+              <w:t>Soulagée</w:t>
+            </w:r>
+            <w:proofErr w:type="spellEnd"/>
           </w:p>
         </w:tc>
         <w:tc>
@@ -4084,21 +4075,7 @@
         <w:rPr>
           <w:lang w:val="fr-FR"/>
         </w:rPr>
-        <w:t xml:space="preserve">• v2.0, révision majeure </w:t>
-      </w:r>
-      <w:proofErr w:type="gramStart"/>
-      <w:r>
-        <w:rPr>
-          <w:lang w:val="fr-FR"/>
-        </w:rPr>
-        <w:t>suite à une</w:t>
-      </w:r>
-      <w:proofErr w:type="gramEnd"/>
-      <w:r>
-        <w:rPr>
-          <w:lang w:val="fr-FR"/>
-        </w:rPr>
-        <w:t xml:space="preserve"> perturbation (changement de scope)</w:t>
+        <w:t>• v2.0, révision majeure suite à une perturbation (changement de scope)</w:t>
       </w:r>
     </w:p>
     <w:p>

</xml_diff>